<commit_message>
Actualizacion y cambios despliegue, soportes
</commit_message>
<xml_diff>
--- a/Soportes/Proyecto2_soporte2.docx
+++ b/Soportes/Proyecto2_soporte2.docx
@@ -34,15 +34,6 @@
         <w:t>MLflow</w:t>
       </w:r>
       <w:proofErr w:type="spellEnd"/>
-    </w:p>
-    <w:p>
-      <w:pPr>
-        <w:rPr>
-          <w:rFonts w:ascii="Times New Roman" w:hAnsi="Times New Roman" w:cs="Times New Roman"/>
-          <w:sz w:val="22"/>
-          <w:szCs w:val="22"/>
-        </w:rPr>
-      </w:pPr>
     </w:p>
     <w:p>
       <w:pPr>
@@ -107,15 +98,34 @@
           <w:sz w:val="22"/>
           <w:szCs w:val="22"/>
         </w:rPr>
-        <w:t>Carga de datos:</w:t>
-      </w:r>
-      <w:r>
-        <w:rPr>
-          <w:rFonts w:ascii="Times New Roman" w:hAnsi="Times New Roman" w:cs="Times New Roman"/>
-          <w:sz w:val="22"/>
-          <w:szCs w:val="22"/>
-        </w:rPr>
-        <w:br/>
+        <w:t>Carga de datos</w:t>
+      </w:r>
+      <w:r>
+        <w:rPr>
+          <w:rFonts w:ascii="Times New Roman" w:hAnsi="Times New Roman" w:cs="Times New Roman"/>
+          <w:b/>
+          <w:bCs/>
+          <w:sz w:val="22"/>
+          <w:szCs w:val="22"/>
+        </w:rPr>
+        <w:t>:</w:t>
+      </w:r>
+    </w:p>
+    <w:p>
+      <w:pPr>
+        <w:ind w:left="720"/>
+        <w:rPr>
+          <w:rFonts w:ascii="Times New Roman" w:hAnsi="Times New Roman" w:cs="Times New Roman"/>
+          <w:sz w:val="22"/>
+          <w:szCs w:val="22"/>
+        </w:rPr>
+      </w:pPr>
+      <w:r>
+        <w:rPr>
+          <w:rFonts w:ascii="Times New Roman" w:hAnsi="Times New Roman" w:cs="Times New Roman"/>
+          <w:sz w:val="22"/>
+          <w:szCs w:val="22"/>
+        </w:rPr>
         <w:t xml:space="preserve">Se carga el archivo limpio saber11_limpio.csv en un </w:t>
       </w:r>
       <w:proofErr w:type="spellStart"/>
@@ -954,7 +964,6 @@
           <w:sz w:val="22"/>
           <w:szCs w:val="22"/>
         </w:rPr>
-        <w:lastRenderedPageBreak/>
         <w:t xml:space="preserve">Se entrena el modelo con </w:t>
       </w:r>
       <w:proofErr w:type="spellStart"/>
@@ -1012,6 +1021,7 @@
           <w:sz w:val="22"/>
           <w:szCs w:val="22"/>
         </w:rPr>
+        <w:lastRenderedPageBreak/>
         <w:t xml:space="preserve">Se usa validación interna (20% del </w:t>
       </w:r>
       <w:proofErr w:type="spellStart"/>
@@ -3171,35 +3181,8 @@
           <w:sz w:val="22"/>
           <w:szCs w:val="22"/>
         </w:rPr>
-        <w:t xml:space="preserve"> – </w:t>
-      </w:r>
-      <w:proofErr w:type="spellStart"/>
-      <w:r>
-        <w:rPr>
-          <w:rFonts w:ascii="Times New Roman" w:hAnsi="Times New Roman" w:cs="Times New Roman"/>
-          <w:sz w:val="22"/>
-          <w:szCs w:val="22"/>
-        </w:rPr>
-        <w:t>Maria</w:t>
-      </w:r>
-      <w:proofErr w:type="spellEnd"/>
-      <w:r>
-        <w:rPr>
-          <w:rFonts w:ascii="Times New Roman" w:hAnsi="Times New Roman" w:cs="Times New Roman"/>
-          <w:sz w:val="22"/>
-          <w:szCs w:val="22"/>
-        </w:rPr>
-        <w:t xml:space="preserve"> Paula</w:t>
-      </w:r>
-    </w:p>
-    <w:p>
-      <w:pPr>
-        <w:rPr>
-          <w:rFonts w:ascii="Times New Roman" w:hAnsi="Times New Roman" w:cs="Times New Roman"/>
-          <w:sz w:val="22"/>
-          <w:szCs w:val="22"/>
-        </w:rPr>
-      </w:pPr>
+        <w:t xml:space="preserve"> – Maria Paula</w:t>
+      </w:r>
     </w:p>
     <w:p>
       <w:pPr>
@@ -3247,10 +3230,20 @@
       <w:r>
         <w:rPr>
           <w:rFonts w:ascii="Times New Roman" w:hAnsi="Times New Roman" w:cs="Times New Roman"/>
-          <w:sz w:val="22"/>
-          <w:szCs w:val="22"/>
-        </w:rPr>
-        <w:t>Carga de datos:</w:t>
+          <w:b/>
+          <w:bCs/>
+          <w:sz w:val="22"/>
+          <w:szCs w:val="22"/>
+        </w:rPr>
+        <w:t>Carga de datos</w:t>
+      </w:r>
+      <w:r>
+        <w:rPr>
+          <w:rFonts w:ascii="Times New Roman" w:hAnsi="Times New Roman" w:cs="Times New Roman"/>
+          <w:sz w:val="22"/>
+          <w:szCs w:val="22"/>
+        </w:rPr>
+        <w:t>:</w:t>
       </w:r>
       <w:r>
         <w:rPr>
@@ -3295,6 +3288,8 @@
       <w:r>
         <w:rPr>
           <w:rFonts w:ascii="Times New Roman" w:hAnsi="Times New Roman" w:cs="Times New Roman"/>
+          <w:b/>
+          <w:bCs/>
           <w:sz w:val="22"/>
           <w:szCs w:val="22"/>
         </w:rPr>
@@ -3325,6 +3320,8 @@
       <w:r>
         <w:rPr>
           <w:rFonts w:ascii="Times New Roman" w:hAnsi="Times New Roman" w:cs="Times New Roman"/>
+          <w:b/>
+          <w:bCs/>
           <w:sz w:val="22"/>
           <w:szCs w:val="22"/>
         </w:rPr>
@@ -3391,6 +3388,8 @@
       <w:r>
         <w:rPr>
           <w:rFonts w:ascii="Times New Roman" w:hAnsi="Times New Roman" w:cs="Times New Roman"/>
+          <w:b/>
+          <w:bCs/>
           <w:sz w:val="22"/>
           <w:szCs w:val="22"/>
         </w:rPr>
@@ -3414,13 +3413,17 @@
         </w:numPr>
         <w:rPr>
           <w:rFonts w:ascii="Times New Roman" w:hAnsi="Times New Roman" w:cs="Times New Roman"/>
-          <w:sz w:val="22"/>
-          <w:szCs w:val="22"/>
-        </w:rPr>
-      </w:pPr>
-      <w:r>
-        <w:rPr>
-          <w:rFonts w:ascii="Times New Roman" w:hAnsi="Times New Roman" w:cs="Times New Roman"/>
+          <w:b/>
+          <w:bCs/>
+          <w:sz w:val="22"/>
+          <w:szCs w:val="22"/>
+        </w:rPr>
+      </w:pPr>
+      <w:r>
+        <w:rPr>
+          <w:rFonts w:ascii="Times New Roman" w:hAnsi="Times New Roman" w:cs="Times New Roman"/>
+          <w:b/>
+          <w:bCs/>
           <w:sz w:val="22"/>
           <w:szCs w:val="22"/>
         </w:rPr>
@@ -3466,7 +3469,6 @@
           <w:sz w:val="22"/>
           <w:szCs w:val="22"/>
         </w:rPr>
-        <w:lastRenderedPageBreak/>
         <w:t>Se imputan edades no plausibles (&lt;13 o &gt;60 años) con la mediana y se crea una variable indicadora para estos casos.</w:t>
       </w:r>
     </w:p>
@@ -3488,6 +3490,7 @@
           <w:sz w:val="22"/>
           <w:szCs w:val="22"/>
         </w:rPr>
+        <w:lastRenderedPageBreak/>
         <w:t xml:space="preserve">Se eliminan variables redundantes o extremadamente desbalanceadas (por ejemplo, </w:t>
       </w:r>
       <w:proofErr w:type="spellStart"/>
@@ -3535,13 +3538,17 @@
         </w:numPr>
         <w:rPr>
           <w:rFonts w:ascii="Times New Roman" w:hAnsi="Times New Roman" w:cs="Times New Roman"/>
-          <w:sz w:val="22"/>
-          <w:szCs w:val="22"/>
-        </w:rPr>
-      </w:pPr>
-      <w:r>
-        <w:rPr>
-          <w:rFonts w:ascii="Times New Roman" w:hAnsi="Times New Roman" w:cs="Times New Roman"/>
+          <w:b/>
+          <w:bCs/>
+          <w:sz w:val="22"/>
+          <w:szCs w:val="22"/>
+        </w:rPr>
+      </w:pPr>
+      <w:r>
+        <w:rPr>
+          <w:rFonts w:ascii="Times New Roman" w:hAnsi="Times New Roman" w:cs="Times New Roman"/>
+          <w:b/>
+          <w:bCs/>
           <w:sz w:val="22"/>
           <w:szCs w:val="22"/>
         </w:rPr>
@@ -3659,6 +3666,8 @@
       <w:r>
         <w:rPr>
           <w:rFonts w:ascii="Times New Roman" w:hAnsi="Times New Roman" w:cs="Times New Roman"/>
+          <w:b/>
+          <w:bCs/>
           <w:sz w:val="22"/>
           <w:szCs w:val="22"/>
         </w:rPr>
@@ -3732,7 +3741,14 @@
           <w:sz w:val="22"/>
           <w:szCs w:val="22"/>
         </w:rPr>
-        <w:br/>
+        <w:t xml:space="preserve"> </w:t>
+      </w:r>
+      <w:r>
+        <w:rPr>
+          <w:rFonts w:ascii="Times New Roman" w:hAnsi="Times New Roman" w:cs="Times New Roman"/>
+          <w:sz w:val="22"/>
+          <w:szCs w:val="22"/>
+        </w:rPr>
         <w:t>Se calcula la correlación de todas las variables con el puntaje global y se grafican las más relevantes.</w:t>
       </w:r>
     </w:p>
@@ -3762,7 +3778,14 @@
           <w:sz w:val="22"/>
           <w:szCs w:val="22"/>
         </w:rPr>
-        <w:br/>
+        <w:t xml:space="preserve"> </w:t>
+      </w:r>
+      <w:r>
+        <w:rPr>
+          <w:rFonts w:ascii="Times New Roman" w:hAnsi="Times New Roman" w:cs="Times New Roman"/>
+          <w:sz w:val="22"/>
+          <w:szCs w:val="22"/>
+        </w:rPr>
         <w:t xml:space="preserve">Se analiza la diferencia de medias del puntaje global según el valor de cada variable </w:t>
       </w:r>
       <w:proofErr w:type="spellStart"/>
@@ -3810,20 +3833,16 @@
           <w:sz w:val="22"/>
           <w:szCs w:val="22"/>
         </w:rPr>
-        <w:br/>
+        <w:t xml:space="preserve"> </w:t>
+      </w:r>
+      <w:r>
+        <w:rPr>
+          <w:rFonts w:ascii="Times New Roman" w:hAnsi="Times New Roman" w:cs="Times New Roman"/>
+          <w:sz w:val="22"/>
+          <w:szCs w:val="22"/>
+        </w:rPr>
         <w:t>Se seleccionan las variables con mayor correlación y diferencia de medias para usarlas como predictores.</w:t>
       </w:r>
-    </w:p>
-    <w:p>
-      <w:pPr>
-        <w:rPr>
-          <w:rFonts w:ascii="Times New Roman" w:hAnsi="Times New Roman" w:cs="Times New Roman"/>
-          <w:b/>
-          <w:bCs/>
-          <w:sz w:val="22"/>
-          <w:szCs w:val="22"/>
-        </w:rPr>
-      </w:pPr>
     </w:p>
     <w:p>
       <w:pPr>
@@ -3882,10 +3901,20 @@
       <w:r>
         <w:rPr>
           <w:rFonts w:ascii="Times New Roman" w:hAnsi="Times New Roman" w:cs="Times New Roman"/>
-          <w:sz w:val="22"/>
-          <w:szCs w:val="22"/>
-        </w:rPr>
-        <w:t>X: Matriz de variables predictoras seleccionadas (familiares, institucionales, recursos tecnológicos, género, edad, etc.).</w:t>
+          <w:b/>
+          <w:bCs/>
+          <w:sz w:val="22"/>
+          <w:szCs w:val="22"/>
+        </w:rPr>
+        <w:t>X</w:t>
+      </w:r>
+      <w:r>
+        <w:rPr>
+          <w:rFonts w:ascii="Times New Roman" w:hAnsi="Times New Roman" w:cs="Times New Roman"/>
+          <w:sz w:val="22"/>
+          <w:szCs w:val="22"/>
+        </w:rPr>
+        <w:t>: Matriz de variables predictoras seleccionadas (familiares, institucionales, recursos tecnológicos, género, edad, etc.).</w:t>
       </w:r>
     </w:p>
     <w:p>
@@ -3903,10 +3932,20 @@
       <w:r>
         <w:rPr>
           <w:rFonts w:ascii="Times New Roman" w:hAnsi="Times New Roman" w:cs="Times New Roman"/>
-          <w:sz w:val="22"/>
-          <w:szCs w:val="22"/>
-        </w:rPr>
-        <w:t>y: Variable objetivo, el puntaje global (</w:t>
+          <w:b/>
+          <w:bCs/>
+          <w:sz w:val="22"/>
+          <w:szCs w:val="22"/>
+        </w:rPr>
+        <w:t>Y</w:t>
+      </w:r>
+      <w:r>
+        <w:rPr>
+          <w:rFonts w:ascii="Times New Roman" w:hAnsi="Times New Roman" w:cs="Times New Roman"/>
+          <w:sz w:val="22"/>
+          <w:szCs w:val="22"/>
+        </w:rPr>
+        <w:t>: Variable objetivo, el puntaje global (</w:t>
       </w:r>
       <w:proofErr w:type="spellStart"/>
       <w:r>
@@ -3987,14 +4026,14 @@
           <w:sz w:val="22"/>
           <w:szCs w:val="22"/>
         </w:rPr>
-        <w:t>Modelado y entrenamiento</w:t>
+        <w:t>Modelos y entrenamiento</w:t>
       </w:r>
     </w:p>
     <w:p>
       <w:pPr>
         <w:numPr>
           <w:ilvl w:val="0"/>
-          <w:numId w:val="22"/>
+          <w:numId w:val="15"/>
         </w:numPr>
         <w:rPr>
           <w:rFonts w:ascii="Times New Roman" w:hAnsi="Times New Roman" w:cs="Times New Roman"/>
@@ -4005,19 +4044,54 @@
       <w:r>
         <w:rPr>
           <w:rFonts w:ascii="Times New Roman" w:hAnsi="Times New Roman" w:cs="Times New Roman"/>
-          <w:sz w:val="22"/>
-          <w:szCs w:val="22"/>
-        </w:rPr>
-        <w:t>Definición del modelo:</w:t>
-      </w:r>
-      <w:r>
-        <w:rPr>
-          <w:rFonts w:ascii="Times New Roman" w:hAnsi="Times New Roman" w:cs="Times New Roman"/>
-          <w:sz w:val="22"/>
-          <w:szCs w:val="22"/>
-        </w:rPr>
-        <w:br/>
-        <w:t xml:space="preserve">Se define una red neuronal en </w:t>
+          <w:b/>
+          <w:bCs/>
+          <w:sz w:val="22"/>
+          <w:szCs w:val="22"/>
+        </w:rPr>
+        <w:t>Modelo base:</w:t>
+      </w:r>
+    </w:p>
+    <w:p>
+      <w:pPr>
+        <w:numPr>
+          <w:ilvl w:val="1"/>
+          <w:numId w:val="15"/>
+        </w:numPr>
+        <w:rPr>
+          <w:rFonts w:ascii="Times New Roman" w:hAnsi="Times New Roman" w:cs="Times New Roman"/>
+          <w:sz w:val="22"/>
+          <w:szCs w:val="22"/>
+        </w:rPr>
+      </w:pPr>
+      <w:r>
+        <w:rPr>
+          <w:rFonts w:ascii="Times New Roman" w:hAnsi="Times New Roman" w:cs="Times New Roman"/>
+          <w:sz w:val="22"/>
+          <w:szCs w:val="22"/>
+        </w:rPr>
+        <w:t xml:space="preserve">El Modelo 1 inicia con una capa de normalización que ajusta la escala de las variables de entrada antes del entrenamiento. </w:t>
+      </w:r>
+    </w:p>
+    <w:p>
+      <w:pPr>
+        <w:numPr>
+          <w:ilvl w:val="1"/>
+          <w:numId w:val="15"/>
+        </w:numPr>
+        <w:rPr>
+          <w:rFonts w:ascii="Times New Roman" w:hAnsi="Times New Roman" w:cs="Times New Roman"/>
+          <w:sz w:val="22"/>
+          <w:szCs w:val="22"/>
+        </w:rPr>
+      </w:pPr>
+      <w:r>
+        <w:rPr>
+          <w:rFonts w:ascii="Times New Roman" w:hAnsi="Times New Roman" w:cs="Times New Roman"/>
+          <w:sz w:val="22"/>
+          <w:szCs w:val="22"/>
+        </w:rPr>
+        <w:t xml:space="preserve">Luego utiliza una capa densa oculta de 32 neuronas con activación </w:t>
       </w:r>
       <w:proofErr w:type="spellStart"/>
       <w:r>
@@ -4026,7 +4100,7 @@
           <w:sz w:val="22"/>
           <w:szCs w:val="22"/>
         </w:rPr>
-        <w:t>Keras</w:t>
+        <w:t>ReLU</w:t>
       </w:r>
       <w:proofErr w:type="spellEnd"/>
       <w:r>
@@ -4035,32 +4109,35 @@
           <w:sz w:val="22"/>
           <w:szCs w:val="22"/>
         </w:rPr>
-        <w:t xml:space="preserve">, ajustando la arquitectura y los </w:t>
-      </w:r>
-      <w:proofErr w:type="spellStart"/>
-      <w:r>
-        <w:rPr>
-          <w:rFonts w:ascii="Times New Roman" w:hAnsi="Times New Roman" w:cs="Times New Roman"/>
-          <w:sz w:val="22"/>
-          <w:szCs w:val="22"/>
-        </w:rPr>
-        <w:t>hiperparámetros</w:t>
-      </w:r>
-      <w:proofErr w:type="spellEnd"/>
-      <w:r>
-        <w:rPr>
-          <w:rFonts w:ascii="Times New Roman" w:hAnsi="Times New Roman" w:cs="Times New Roman"/>
-          <w:sz w:val="22"/>
-          <w:szCs w:val="22"/>
-        </w:rPr>
-        <w:t xml:space="preserve"> según el análisis exploratorio.</w:t>
+        <w:t xml:space="preserve"> para aprender relaciones no lineales entre los predictores y el puntaje global. </w:t>
+      </w:r>
+    </w:p>
+    <w:p>
+      <w:pPr>
+        <w:numPr>
+          <w:ilvl w:val="1"/>
+          <w:numId w:val="15"/>
+        </w:numPr>
+        <w:rPr>
+          <w:rFonts w:ascii="Times New Roman" w:hAnsi="Times New Roman" w:cs="Times New Roman"/>
+          <w:sz w:val="22"/>
+          <w:szCs w:val="22"/>
+        </w:rPr>
+      </w:pPr>
+      <w:r>
+        <w:rPr>
+          <w:rFonts w:ascii="Times New Roman" w:hAnsi="Times New Roman" w:cs="Times New Roman"/>
+          <w:sz w:val="22"/>
+          <w:szCs w:val="22"/>
+        </w:rPr>
+        <w:t>Finalmente, incluye una capa de salida con una sola neurona, adecuada para un problema de regresión donde se estima un valor continuo.</w:t>
       </w:r>
     </w:p>
     <w:p>
       <w:pPr>
         <w:numPr>
           <w:ilvl w:val="0"/>
-          <w:numId w:val="22"/>
+          <w:numId w:val="15"/>
         </w:numPr>
         <w:rPr>
           <w:rFonts w:ascii="Times New Roman" w:hAnsi="Times New Roman" w:cs="Times New Roman"/>
@@ -4071,18 +4148,30 @@
       <w:r>
         <w:rPr>
           <w:rFonts w:ascii="Times New Roman" w:hAnsi="Times New Roman" w:cs="Times New Roman"/>
+          <w:b/>
+          <w:bCs/>
           <w:sz w:val="22"/>
           <w:szCs w:val="22"/>
         </w:rPr>
         <w:lastRenderedPageBreak/>
-        <w:t>Entrenamiento:</w:t>
+        <w:t>Red neuronal</w:t>
+      </w:r>
+      <w:r>
+        <w:rPr>
+          <w:rFonts w:ascii="Times New Roman" w:hAnsi="Times New Roman" w:cs="Times New Roman"/>
+          <w:b/>
+          <w:bCs/>
+          <w:sz w:val="22"/>
+          <w:szCs w:val="22"/>
+        </w:rPr>
+        <w:t>:</w:t>
       </w:r>
     </w:p>
     <w:p>
       <w:pPr>
         <w:numPr>
           <w:ilvl w:val="1"/>
-          <w:numId w:val="22"/>
+          <w:numId w:val="15"/>
         </w:numPr>
         <w:rPr>
           <w:rFonts w:ascii="Times New Roman" w:hAnsi="Times New Roman" w:cs="Times New Roman"/>
@@ -4096,14 +4185,32 @@
           <w:sz w:val="22"/>
           <w:szCs w:val="22"/>
         </w:rPr>
-        <w:t>Se entrena el modelo con los datos de entrenamiento.</w:t>
+        <w:t xml:space="preserve">Se probaron arquitecturas secuenciales en </w:t>
+      </w:r>
+      <w:proofErr w:type="spellStart"/>
+      <w:r>
+        <w:rPr>
+          <w:rFonts w:ascii="Times New Roman" w:hAnsi="Times New Roman" w:cs="Times New Roman"/>
+          <w:sz w:val="22"/>
+          <w:szCs w:val="22"/>
+        </w:rPr>
+        <w:t>Keras</w:t>
+      </w:r>
+      <w:proofErr w:type="spellEnd"/>
+      <w:r>
+        <w:rPr>
+          <w:rFonts w:ascii="Times New Roman" w:hAnsi="Times New Roman" w:cs="Times New Roman"/>
+          <w:sz w:val="22"/>
+          <w:szCs w:val="22"/>
+        </w:rPr>
+        <w:t xml:space="preserve">, manteniendo una capa inicial de normalización para estabilizar el entrenamiento. </w:t>
       </w:r>
     </w:p>
     <w:p>
       <w:pPr>
         <w:numPr>
           <w:ilvl w:val="1"/>
-          <w:numId w:val="22"/>
+          <w:numId w:val="15"/>
         </w:numPr>
         <w:rPr>
           <w:rFonts w:ascii="Times New Roman" w:hAnsi="Times New Roman" w:cs="Times New Roman"/>
@@ -4117,7 +4224,7 @@
           <w:sz w:val="22"/>
           <w:szCs w:val="22"/>
         </w:rPr>
-        <w:t xml:space="preserve">Se utiliza validación interna y técnicas como </w:t>
+        <w:t xml:space="preserve">El Modelo 2 amplía la arquitectura base con dos capas densas de 64 y 32 neuronas, incorporando una capa </w:t>
       </w:r>
       <w:proofErr w:type="spellStart"/>
       <w:r>
@@ -4126,7 +4233,7 @@
           <w:sz w:val="22"/>
           <w:szCs w:val="22"/>
         </w:rPr>
-        <w:t>EarlyStopping</w:t>
+        <w:t>Dropout</w:t>
       </w:r>
       <w:proofErr w:type="spellEnd"/>
       <w:r>
@@ -4135,14 +4242,14 @@
           <w:sz w:val="22"/>
           <w:szCs w:val="22"/>
         </w:rPr>
-        <w:t xml:space="preserve"> para evitar sobreajuste.</w:t>
+        <w:t xml:space="preserve"> de 0.2 para reducir sobreajuste. </w:t>
       </w:r>
     </w:p>
     <w:p>
       <w:pPr>
         <w:numPr>
           <w:ilvl w:val="1"/>
-          <w:numId w:val="22"/>
+          <w:numId w:val="15"/>
         </w:numPr>
         <w:rPr>
           <w:rFonts w:ascii="Times New Roman" w:hAnsi="Times New Roman" w:cs="Times New Roman"/>
@@ -4156,7 +4263,340 @@
           <w:sz w:val="22"/>
           <w:szCs w:val="22"/>
         </w:rPr>
-        <w:t>Se almacenan las métricas y el historial de entrenamiento.</w:t>
+        <w:t xml:space="preserve">El Modelo 3 conserva las dos capas densas de 64 y 32 neuronas, pero elimina </w:t>
+      </w:r>
+      <w:proofErr w:type="spellStart"/>
+      <w:r>
+        <w:rPr>
+          <w:rFonts w:ascii="Times New Roman" w:hAnsi="Times New Roman" w:cs="Times New Roman"/>
+          <w:sz w:val="22"/>
+          <w:szCs w:val="22"/>
+        </w:rPr>
+        <w:t>Dropout</w:t>
+      </w:r>
+      <w:proofErr w:type="spellEnd"/>
+      <w:r>
+        <w:rPr>
+          <w:rFonts w:ascii="Times New Roman" w:hAnsi="Times New Roman" w:cs="Times New Roman"/>
+          <w:sz w:val="22"/>
+          <w:szCs w:val="22"/>
+        </w:rPr>
+        <w:t xml:space="preserve"> para comparar si la regularización mejoraba o no el desempeño.</w:t>
+      </w:r>
+    </w:p>
+    <w:p>
+      <w:pPr>
+        <w:numPr>
+          <w:ilvl w:val="0"/>
+          <w:numId w:val="15"/>
+        </w:numPr>
+        <w:rPr>
+          <w:rFonts w:ascii="Times New Roman" w:hAnsi="Times New Roman" w:cs="Times New Roman"/>
+          <w:sz w:val="22"/>
+          <w:szCs w:val="22"/>
+        </w:rPr>
+      </w:pPr>
+      <w:r>
+        <w:rPr>
+          <w:rFonts w:ascii="Times New Roman" w:hAnsi="Times New Roman" w:cs="Times New Roman"/>
+          <w:b/>
+          <w:bCs/>
+          <w:sz w:val="22"/>
+          <w:szCs w:val="22"/>
+        </w:rPr>
+        <w:t>Entrenamiento:</w:t>
+      </w:r>
+    </w:p>
+    <w:p>
+      <w:pPr>
+        <w:pStyle w:val="Prrafodelista"/>
+        <w:numPr>
+          <w:ilvl w:val="1"/>
+          <w:numId w:val="15"/>
+        </w:numPr>
+        <w:spacing w:after="0" w:line="240" w:lineRule="auto"/>
+        <w:rPr>
+          <w:rFonts w:ascii="Times New Roman" w:eastAsia="Times New Roman" w:hAnsi="Times New Roman" w:cs="Times New Roman"/>
+          <w:kern w:val="0"/>
+          <w:sz w:val="22"/>
+          <w:szCs w:val="22"/>
+          <w:lang w:eastAsia="es-CO"/>
+          <w14:ligatures w14:val="none"/>
+        </w:rPr>
+      </w:pPr>
+      <w:r>
+        <w:rPr>
+          <w:rFonts w:ascii="Times New Roman" w:eastAsia="Times New Roman" w:hAnsi="Times New Roman" w:cs="Times New Roman"/>
+          <w:kern w:val="0"/>
+          <w:sz w:val="22"/>
+          <w:szCs w:val="22"/>
+          <w:lang w:eastAsia="es-CO"/>
+          <w14:ligatures w14:val="none"/>
+        </w:rPr>
+        <w:t xml:space="preserve">Se entrenaron los modelos con </w:t>
+      </w:r>
+      <w:r>
+        <w:rPr>
+          <w:rFonts w:ascii="Times New Roman" w:eastAsia="Times New Roman" w:hAnsi="Times New Roman" w:cs="Times New Roman"/>
+          <w:b/>
+          <w:bCs/>
+          <w:kern w:val="0"/>
+          <w:sz w:val="22"/>
+          <w:szCs w:val="22"/>
+          <w:lang w:eastAsia="es-CO"/>
+          <w14:ligatures w14:val="none"/>
+        </w:rPr>
+        <w:t>Adam</w:t>
+      </w:r>
+      <w:r>
+        <w:rPr>
+          <w:rFonts w:ascii="Times New Roman" w:eastAsia="Times New Roman" w:hAnsi="Times New Roman" w:cs="Times New Roman"/>
+          <w:kern w:val="0"/>
+          <w:sz w:val="22"/>
+          <w:szCs w:val="22"/>
+          <w:lang w:eastAsia="es-CO"/>
+          <w14:ligatures w14:val="none"/>
+        </w:rPr>
+        <w:t xml:space="preserve">, pérdida </w:t>
+      </w:r>
+      <w:r>
+        <w:rPr>
+          <w:rFonts w:ascii="Times New Roman" w:eastAsia="Times New Roman" w:hAnsi="Times New Roman" w:cs="Times New Roman"/>
+          <w:b/>
+          <w:bCs/>
+          <w:kern w:val="0"/>
+          <w:sz w:val="22"/>
+          <w:szCs w:val="22"/>
+          <w:lang w:eastAsia="es-CO"/>
+          <w14:ligatures w14:val="none"/>
+        </w:rPr>
+        <w:t>MSE</w:t>
+      </w:r>
+      <w:r>
+        <w:rPr>
+          <w:rFonts w:ascii="Times New Roman" w:eastAsia="Times New Roman" w:hAnsi="Times New Roman" w:cs="Times New Roman"/>
+          <w:kern w:val="0"/>
+          <w:sz w:val="22"/>
+          <w:szCs w:val="22"/>
+          <w:lang w:eastAsia="es-CO"/>
+          <w14:ligatures w14:val="none"/>
+        </w:rPr>
+        <w:t xml:space="preserve"> y métrica </w:t>
+      </w:r>
+      <w:r>
+        <w:rPr>
+          <w:rFonts w:ascii="Times New Roman" w:eastAsia="Times New Roman" w:hAnsi="Times New Roman" w:cs="Times New Roman"/>
+          <w:b/>
+          <w:bCs/>
+          <w:kern w:val="0"/>
+          <w:sz w:val="22"/>
+          <w:szCs w:val="22"/>
+          <w:lang w:eastAsia="es-CO"/>
+          <w14:ligatures w14:val="none"/>
+        </w:rPr>
+        <w:t>MAE</w:t>
+      </w:r>
+      <w:r>
+        <w:rPr>
+          <w:rFonts w:ascii="Times New Roman" w:eastAsia="Times New Roman" w:hAnsi="Times New Roman" w:cs="Times New Roman"/>
+          <w:kern w:val="0"/>
+          <w:sz w:val="22"/>
+          <w:szCs w:val="22"/>
+          <w:lang w:eastAsia="es-CO"/>
+          <w14:ligatures w14:val="none"/>
+        </w:rPr>
+        <w:t xml:space="preserve">, usando una partición de entrenamiento y prueba para evaluar el desempeño fuera de muestra. </w:t>
+      </w:r>
+    </w:p>
+    <w:p>
+      <w:pPr>
+        <w:pStyle w:val="Prrafodelista"/>
+        <w:numPr>
+          <w:ilvl w:val="1"/>
+          <w:numId w:val="15"/>
+        </w:numPr>
+        <w:spacing w:after="0" w:line="240" w:lineRule="auto"/>
+        <w:rPr>
+          <w:rFonts w:ascii="Times New Roman" w:eastAsia="Times New Roman" w:hAnsi="Times New Roman" w:cs="Times New Roman"/>
+          <w:kern w:val="0"/>
+          <w:sz w:val="22"/>
+          <w:szCs w:val="22"/>
+          <w:lang w:eastAsia="es-CO"/>
+          <w14:ligatures w14:val="none"/>
+        </w:rPr>
+      </w:pPr>
+      <w:r>
+        <w:rPr>
+          <w:rFonts w:ascii="Times New Roman" w:eastAsia="Times New Roman" w:hAnsi="Times New Roman" w:cs="Times New Roman"/>
+          <w:kern w:val="0"/>
+          <w:sz w:val="22"/>
+          <w:szCs w:val="22"/>
+          <w:lang w:eastAsia="es-CO"/>
+          <w14:ligatures w14:val="none"/>
+        </w:rPr>
+        <w:t xml:space="preserve">Se usó </w:t>
+      </w:r>
+      <w:proofErr w:type="spellStart"/>
+      <w:r>
+        <w:rPr>
+          <w:rFonts w:ascii="Times New Roman" w:eastAsia="Times New Roman" w:hAnsi="Times New Roman" w:cs="Times New Roman"/>
+          <w:b/>
+          <w:bCs/>
+          <w:kern w:val="0"/>
+          <w:sz w:val="22"/>
+          <w:szCs w:val="22"/>
+          <w:lang w:eastAsia="es-CO"/>
+          <w14:ligatures w14:val="none"/>
+        </w:rPr>
+        <w:t>EarlyStopping</w:t>
+      </w:r>
+      <w:proofErr w:type="spellEnd"/>
+      <w:r>
+        <w:rPr>
+          <w:rFonts w:ascii="Times New Roman" w:eastAsia="Times New Roman" w:hAnsi="Times New Roman" w:cs="Times New Roman"/>
+          <w:b/>
+          <w:bCs/>
+          <w:kern w:val="0"/>
+          <w:sz w:val="22"/>
+          <w:szCs w:val="22"/>
+          <w:lang w:eastAsia="es-CO"/>
+          <w14:ligatures w14:val="none"/>
+        </w:rPr>
+        <w:t xml:space="preserve"> con paciencia de 5 épocas</w:t>
+      </w:r>
+      <w:r>
+        <w:rPr>
+          <w:rFonts w:ascii="Times New Roman" w:eastAsia="Times New Roman" w:hAnsi="Times New Roman" w:cs="Times New Roman"/>
+          <w:kern w:val="0"/>
+          <w:sz w:val="22"/>
+          <w:szCs w:val="22"/>
+          <w:lang w:eastAsia="es-CO"/>
+          <w14:ligatures w14:val="none"/>
+        </w:rPr>
+        <w:t xml:space="preserve">, para detener el entrenamiento cuando la pérdida de validación dejaba de mejorar y recuperar los mejores pesos. </w:t>
+      </w:r>
+    </w:p>
+    <w:p>
+      <w:pPr>
+        <w:pStyle w:val="Prrafodelista"/>
+        <w:numPr>
+          <w:ilvl w:val="1"/>
+          <w:numId w:val="15"/>
+        </w:numPr>
+        <w:rPr>
+          <w:rFonts w:ascii="Times New Roman" w:hAnsi="Times New Roman" w:cs="Times New Roman"/>
+          <w:sz w:val="22"/>
+          <w:szCs w:val="22"/>
+        </w:rPr>
+      </w:pPr>
+      <w:r>
+        <w:rPr>
+          <w:rFonts w:ascii="Times New Roman" w:eastAsia="Times New Roman" w:hAnsi="Times New Roman" w:cs="Times New Roman"/>
+          <w:kern w:val="0"/>
+          <w:sz w:val="22"/>
+          <w:szCs w:val="22"/>
+          <w:lang w:eastAsia="es-CO"/>
+          <w14:ligatures w14:val="none"/>
+        </w:rPr>
+        <w:t xml:space="preserve">Los experimentos se registraron en </w:t>
+      </w:r>
+      <w:proofErr w:type="spellStart"/>
+      <w:r>
+        <w:rPr>
+          <w:rFonts w:ascii="Times New Roman" w:eastAsia="Times New Roman" w:hAnsi="Times New Roman" w:cs="Times New Roman"/>
+          <w:b/>
+          <w:bCs/>
+          <w:kern w:val="0"/>
+          <w:sz w:val="22"/>
+          <w:szCs w:val="22"/>
+          <w:lang w:eastAsia="es-CO"/>
+          <w14:ligatures w14:val="none"/>
+        </w:rPr>
+        <w:t>MLflow</w:t>
+      </w:r>
+      <w:proofErr w:type="spellEnd"/>
+      <w:r>
+        <w:rPr>
+          <w:rFonts w:ascii="Times New Roman" w:eastAsia="Times New Roman" w:hAnsi="Times New Roman" w:cs="Times New Roman"/>
+          <w:kern w:val="0"/>
+          <w:sz w:val="22"/>
+          <w:szCs w:val="22"/>
+          <w:lang w:eastAsia="es-CO"/>
+          <w14:ligatures w14:val="none"/>
+        </w:rPr>
+        <w:t xml:space="preserve">, comparando combinaciones con y sin </w:t>
+      </w:r>
+      <w:proofErr w:type="spellStart"/>
+      <w:r>
+        <w:rPr>
+          <w:rFonts w:ascii="Times New Roman" w:eastAsia="Times New Roman" w:hAnsi="Times New Roman" w:cs="Times New Roman"/>
+          <w:kern w:val="0"/>
+          <w:sz w:val="22"/>
+          <w:szCs w:val="22"/>
+          <w:lang w:eastAsia="es-CO"/>
+          <w14:ligatures w14:val="none"/>
+        </w:rPr>
+        <w:t>Dropout</w:t>
+      </w:r>
+      <w:proofErr w:type="spellEnd"/>
+      <w:r>
+        <w:rPr>
+          <w:rFonts w:ascii="Times New Roman" w:eastAsia="Times New Roman" w:hAnsi="Times New Roman" w:cs="Times New Roman"/>
+          <w:kern w:val="0"/>
+          <w:sz w:val="22"/>
+          <w:szCs w:val="22"/>
+          <w:lang w:eastAsia="es-CO"/>
+          <w14:ligatures w14:val="none"/>
+        </w:rPr>
+        <w:t xml:space="preserve"> mediante </w:t>
+      </w:r>
+      <w:r>
+        <w:rPr>
+          <w:rFonts w:ascii="Times New Roman" w:eastAsia="Times New Roman" w:hAnsi="Times New Roman" w:cs="Times New Roman"/>
+          <w:b/>
+          <w:bCs/>
+          <w:kern w:val="0"/>
+          <w:sz w:val="22"/>
+          <w:szCs w:val="22"/>
+          <w:lang w:eastAsia="es-CO"/>
+          <w14:ligatures w14:val="none"/>
+        </w:rPr>
+        <w:t>RMSE, MAE y R²</w:t>
+      </w:r>
+      <w:r>
+        <w:rPr>
+          <w:rFonts w:ascii="Times New Roman" w:eastAsia="Times New Roman" w:hAnsi="Times New Roman" w:cs="Times New Roman"/>
+          <w:kern w:val="0"/>
+          <w:sz w:val="22"/>
+          <w:szCs w:val="22"/>
+          <w:lang w:eastAsia="es-CO"/>
+          <w14:ligatures w14:val="none"/>
+        </w:rPr>
+        <w:t xml:space="preserve">; el mejor desempeño observado alcanzó un </w:t>
+      </w:r>
+      <w:r>
+        <w:rPr>
+          <w:rFonts w:ascii="Times New Roman" w:eastAsia="Times New Roman" w:hAnsi="Times New Roman" w:cs="Times New Roman"/>
+          <w:b/>
+          <w:bCs/>
+          <w:kern w:val="0"/>
+          <w:sz w:val="22"/>
+          <w:szCs w:val="22"/>
+          <w:lang w:eastAsia="es-CO"/>
+          <w14:ligatures w14:val="none"/>
+        </w:rPr>
+        <w:t>R² cercano a 0.354</w:t>
+      </w:r>
+      <w:r>
+        <w:rPr>
+          <w:rFonts w:ascii="Times New Roman" w:eastAsia="Times New Roman" w:hAnsi="Times New Roman" w:cs="Times New Roman"/>
+          <w:kern w:val="0"/>
+          <w:sz w:val="22"/>
+          <w:szCs w:val="22"/>
+          <w:lang w:eastAsia="es-CO"/>
+          <w14:ligatures w14:val="none"/>
+        </w:rPr>
+        <w:t>.</w:t>
       </w:r>
     </w:p>
     <w:p>
@@ -4423,7 +4863,23 @@
           <w:sz w:val="22"/>
           <w:szCs w:val="22"/>
         </w:rPr>
-        <w:t>Se guarda el modelo entrenado como artefacto.</w:t>
+        <w:t xml:space="preserve">Se guarda el </w:t>
+      </w:r>
+      <w:r>
+        <w:rPr>
+          <w:rFonts w:ascii="Times New Roman" w:hAnsi="Times New Roman" w:cs="Times New Roman"/>
+          <w:sz w:val="22"/>
+          <w:szCs w:val="22"/>
+        </w:rPr>
+        <w:t xml:space="preserve">mejor </w:t>
+      </w:r>
+      <w:r>
+        <w:rPr>
+          <w:rFonts w:ascii="Times New Roman" w:hAnsi="Times New Roman" w:cs="Times New Roman"/>
+          <w:sz w:val="22"/>
+          <w:szCs w:val="22"/>
+        </w:rPr>
+        <w:t>modelo entrenado como artefacto.</w:t>
       </w:r>
     </w:p>
     <w:p>
@@ -4479,6 +4935,162 @@
           <w:szCs w:val="22"/>
         </w:rPr>
       </w:pPr>
+      <w:r>
+        <w:rPr>
+          <w:rFonts w:ascii="Times New Roman" w:hAnsi="Times New Roman" w:cs="Times New Roman"/>
+          <w:b/>
+          <w:bCs/>
+          <w:sz w:val="22"/>
+          <w:szCs w:val="22"/>
+        </w:rPr>
+        <w:lastRenderedPageBreak/>
+        <w:drawing>
+          <wp:inline distT="0" distB="0" distL="0" distR="0" wp14:anchorId="7239EA39" wp14:editId="3A541551">
+            <wp:extent cx="5943600" cy="3256915"/>
+            <wp:effectExtent l="0" t="0" r="0" b="635"/>
+            <wp:docPr id="423174707" name="Imagen 1"/>
+            <wp:cNvGraphicFramePr>
+              <a:graphicFrameLocks xmlns:a="http://schemas.openxmlformats.org/drawingml/2006/main" noChangeAspect="1"/>
+            </wp:cNvGraphicFramePr>
+            <a:graphic xmlns:a="http://schemas.openxmlformats.org/drawingml/2006/main">
+              <a:graphicData uri="http://schemas.openxmlformats.org/drawingml/2006/picture">
+                <pic:pic xmlns:pic="http://schemas.openxmlformats.org/drawingml/2006/picture">
+                  <pic:nvPicPr>
+                    <pic:cNvPr id="423174707" name=""/>
+                    <pic:cNvPicPr/>
+                  </pic:nvPicPr>
+                  <pic:blipFill>
+                    <a:blip r:embed="rId10"/>
+                    <a:stretch>
+                      <a:fillRect/>
+                    </a:stretch>
+                  </pic:blipFill>
+                  <pic:spPr>
+                    <a:xfrm>
+                      <a:off x="0" y="0"/>
+                      <a:ext cx="5943600" cy="3256915"/>
+                    </a:xfrm>
+                    <a:prstGeom prst="rect">
+                      <a:avLst/>
+                    </a:prstGeom>
+                  </pic:spPr>
+                </pic:pic>
+              </a:graphicData>
+            </a:graphic>
+          </wp:inline>
+        </w:drawing>
+      </w:r>
+    </w:p>
+    <w:p>
+      <w:pPr>
+        <w:rPr>
+          <w:rFonts w:ascii="Times New Roman" w:hAnsi="Times New Roman" w:cs="Times New Roman"/>
+          <w:b/>
+          <w:bCs/>
+          <w:sz w:val="22"/>
+          <w:szCs w:val="22"/>
+        </w:rPr>
+      </w:pPr>
+      <w:r>
+        <w:rPr>
+          <w:rFonts w:ascii="Times New Roman" w:hAnsi="Times New Roman" w:cs="Times New Roman"/>
+          <w:b/>
+          <w:bCs/>
+          <w:sz w:val="22"/>
+          <w:szCs w:val="22"/>
+        </w:rPr>
+        <w:drawing>
+          <wp:inline distT="0" distB="0" distL="0" distR="0" wp14:anchorId="7BAAE735" wp14:editId="55B4EA7D">
+            <wp:extent cx="5943600" cy="3768090"/>
+            <wp:effectExtent l="0" t="0" r="0" b="3810"/>
+            <wp:docPr id="1879250064" name="Imagen 1"/>
+            <wp:cNvGraphicFramePr>
+              <a:graphicFrameLocks xmlns:a="http://schemas.openxmlformats.org/drawingml/2006/main" noChangeAspect="1"/>
+            </wp:cNvGraphicFramePr>
+            <a:graphic xmlns:a="http://schemas.openxmlformats.org/drawingml/2006/main">
+              <a:graphicData uri="http://schemas.openxmlformats.org/drawingml/2006/picture">
+                <pic:pic xmlns:pic="http://schemas.openxmlformats.org/drawingml/2006/picture">
+                  <pic:nvPicPr>
+                    <pic:cNvPr id="1879250064" name=""/>
+                    <pic:cNvPicPr/>
+                  </pic:nvPicPr>
+                  <pic:blipFill>
+                    <a:blip r:embed="rId11"/>
+                    <a:stretch>
+                      <a:fillRect/>
+                    </a:stretch>
+                  </pic:blipFill>
+                  <pic:spPr>
+                    <a:xfrm>
+                      <a:off x="0" y="0"/>
+                      <a:ext cx="5943600" cy="3768090"/>
+                    </a:xfrm>
+                    <a:prstGeom prst="rect">
+                      <a:avLst/>
+                    </a:prstGeom>
+                  </pic:spPr>
+                </pic:pic>
+              </a:graphicData>
+            </a:graphic>
+          </wp:inline>
+        </w:drawing>
+      </w:r>
+    </w:p>
+    <w:p>
+      <w:pPr>
+        <w:rPr>
+          <w:rFonts w:ascii="Times New Roman" w:hAnsi="Times New Roman" w:cs="Times New Roman"/>
+          <w:b/>
+          <w:bCs/>
+          <w:sz w:val="22"/>
+          <w:szCs w:val="22"/>
+        </w:rPr>
+      </w:pPr>
+      <w:r>
+        <w:rPr>
+          <w:rFonts w:ascii="Times New Roman" w:hAnsi="Times New Roman" w:cs="Times New Roman"/>
+          <w:b/>
+          <w:bCs/>
+          <w:sz w:val="22"/>
+          <w:szCs w:val="22"/>
+        </w:rPr>
+        <w:lastRenderedPageBreak/>
+        <w:drawing>
+          <wp:inline distT="0" distB="0" distL="0" distR="0" wp14:anchorId="78733430" wp14:editId="083706A2">
+            <wp:extent cx="5943600" cy="3197225"/>
+            <wp:effectExtent l="0" t="0" r="0" b="3175"/>
+            <wp:docPr id="2022569718" name="Imagen 1"/>
+            <wp:cNvGraphicFramePr>
+              <a:graphicFrameLocks xmlns:a="http://schemas.openxmlformats.org/drawingml/2006/main" noChangeAspect="1"/>
+            </wp:cNvGraphicFramePr>
+            <a:graphic xmlns:a="http://schemas.openxmlformats.org/drawingml/2006/main">
+              <a:graphicData uri="http://schemas.openxmlformats.org/drawingml/2006/picture">
+                <pic:pic xmlns:pic="http://schemas.openxmlformats.org/drawingml/2006/picture">
+                  <pic:nvPicPr>
+                    <pic:cNvPr id="2022569718" name=""/>
+                    <pic:cNvPicPr/>
+                  </pic:nvPicPr>
+                  <pic:blipFill>
+                    <a:blip r:embed="rId12"/>
+                    <a:stretch>
+                      <a:fillRect/>
+                    </a:stretch>
+                  </pic:blipFill>
+                  <pic:spPr>
+                    <a:xfrm>
+                      <a:off x="0" y="0"/>
+                      <a:ext cx="5943600" cy="3197225"/>
+                    </a:xfrm>
+                    <a:prstGeom prst="rect">
+                      <a:avLst/>
+                    </a:prstGeom>
+                  </pic:spPr>
+                </pic:pic>
+              </a:graphicData>
+            </a:graphic>
+          </wp:inline>
+        </w:drawing>
+      </w:r>
     </w:p>
     <w:p/>
     <w:sectPr>
@@ -9175,6 +9787,17 @@
       <w:shd w:val="clear" w:color="auto" w:fill="E1DFDD"/>
     </w:rPr>
   </w:style>
+  <w:style w:type="character" w:styleId="Fuerte">
+    <w:name w:val="Strong"/>
+    <w:basedOn w:val="Fuentedeprrafopredeter"/>
+    <w:uiPriority w:val="22"/>
+    <w:qFormat/>
+    <w:rsid w:val="00317A08"/>
+    <w:rPr>
+      <w:b/>
+      <w:bCs/>
+    </w:rPr>
+  </w:style>
 </w:styles>
 </file>
 
@@ -9474,6 +10097,23 @@
 </file>
 
 <file path=customXml/item1.xml><?xml version="1.0" encoding="utf-8"?>
+<p:properties xmlns:p="http://schemas.microsoft.com/office/2006/metadata/properties" xmlns:xsi="http://www.w3.org/2001/XMLSchema-instance" xmlns:pc="http://schemas.microsoft.com/office/infopath/2007/PartnerControls">
+  <documentManagement>
+    <_activity xmlns="9bdcb1d6-9959-4866-ac5f-d407c1740622" xsi:nil="true"/>
+  </documentManagement>
+</p:properties>
+</file>
+
+<file path=customXml/item2.xml><?xml version="1.0" encoding="utf-8"?>
+<?mso-contentType ?>
+<FormTemplates xmlns="http://schemas.microsoft.com/sharepoint/v3/contenttype/forms">
+  <Display>DocumentLibraryForm</Display>
+  <Edit>DocumentLibraryForm</Edit>
+  <New>DocumentLibraryForm</New>
+</FormTemplates>
+</file>
+
+<file path=customXml/item3.xml><?xml version="1.0" encoding="utf-8"?>
 <ct:contentTypeSchema xmlns:ct="http://schemas.microsoft.com/office/2006/metadata/contentType" xmlns:ma="http://schemas.microsoft.com/office/2006/metadata/properties/metaAttributes" ct:_="" ma:_="" ma:contentTypeName="Documento" ma:contentTypeID="0x01010086AD306E560F5D46AEC0D9DB27E01734" ma:contentTypeVersion="15" ma:contentTypeDescription="Crear nuevo documento." ma:contentTypeScope="" ma:versionID="5dc5b6a43626819e79dd3bff81fb2ed5">
   <xsd:schema xmlns:xsd="http://www.w3.org/2001/XMLSchema" xmlns:xs="http://www.w3.org/2001/XMLSchema" xmlns:p="http://schemas.microsoft.com/office/2006/metadata/properties" xmlns:ns3="9bdcb1d6-9959-4866-ac5f-d407c1740622" xmlns:ns4="0ffe1cf2-44d4-4f0d-af60-d9de06ff6e98" targetNamespace="http://schemas.microsoft.com/office/2006/metadata/properties" ma:root="true" ma:fieldsID="e728e1d2e83c61df908f68ede4cbbe00" ns3:_="" ns4:_="">
     <xsd:import namespace="9bdcb1d6-9959-4866-ac5f-d407c1740622"/>
@@ -9708,24 +10348,25 @@
 </ct:contentTypeSchema>
 </file>
 
-<file path=customXml/item2.xml><?xml version="1.0" encoding="utf-8"?>
-<?mso-contentType ?>
-<FormTemplates xmlns="http://schemas.microsoft.com/sharepoint/v3/contenttype/forms">
-  <Display>DocumentLibraryForm</Display>
-  <Edit>DocumentLibraryForm</Edit>
-  <New>DocumentLibraryForm</New>
-</FormTemplates>
+<file path=customXml/itemProps1.xml><?xml version="1.0" encoding="utf-8"?>
+<ds:datastoreItem xmlns:ds="http://schemas.openxmlformats.org/officeDocument/2006/customXml" ds:itemID="{2528CE1B-82B5-4F70-910C-9855C5CED1C8}">
+  <ds:schemaRefs>
+    <ds:schemaRef ds:uri="http://schemas.microsoft.com/office/2006/metadata/properties"/>
+    <ds:schemaRef ds:uri="http://schemas.microsoft.com/office/infopath/2007/PartnerControls"/>
+    <ds:schemaRef ds:uri="9bdcb1d6-9959-4866-ac5f-d407c1740622"/>
+  </ds:schemaRefs>
+</ds:datastoreItem>
 </file>
 
-<file path=customXml/item3.xml><?xml version="1.0" encoding="utf-8"?>
-<p:properties xmlns:p="http://schemas.microsoft.com/office/2006/metadata/properties" xmlns:xsi="http://www.w3.org/2001/XMLSchema-instance" xmlns:pc="http://schemas.microsoft.com/office/infopath/2007/PartnerControls">
-  <documentManagement>
-    <_activity xmlns="9bdcb1d6-9959-4866-ac5f-d407c1740622" xsi:nil="true"/>
-  </documentManagement>
-</p:properties>
+<file path=customXml/itemProps2.xml><?xml version="1.0" encoding="utf-8"?>
+<ds:datastoreItem xmlns:ds="http://schemas.openxmlformats.org/officeDocument/2006/customXml" ds:itemID="{6B765886-DC01-4231-861B-DE0994EFA957}">
+  <ds:schemaRefs>
+    <ds:schemaRef ds:uri="http://schemas.microsoft.com/sharepoint/v3/contenttype/forms"/>
+  </ds:schemaRefs>
+</ds:datastoreItem>
 </file>
 
-<file path=customXml/itemProps1.xml><?xml version="1.0" encoding="utf-8"?>
+<file path=customXml/itemProps3.xml><?xml version="1.0" encoding="utf-8"?>
 <ds:datastoreItem xmlns:ds="http://schemas.openxmlformats.org/officeDocument/2006/customXml" ds:itemID="{F35BC94D-054D-4250-AB8D-96EBA34DB765}">
   <ds:schemaRefs>
     <ds:schemaRef ds:uri="http://schemas.microsoft.com/office/2006/metadata/contentType"/>
@@ -9742,22 +10383,4 @@
     <ds:schemaRef ds:uri="http://schemas.microsoft.com/internal/obd"/>
   </ds:schemaRefs>
 </ds:datastoreItem>
-</file>
-
-<file path=customXml/itemProps2.xml><?xml version="1.0" encoding="utf-8"?>
-<ds:datastoreItem xmlns:ds="http://schemas.openxmlformats.org/officeDocument/2006/customXml" ds:itemID="{6B765886-DC01-4231-861B-DE0994EFA957}">
-  <ds:schemaRefs>
-    <ds:schemaRef ds:uri="http://schemas.microsoft.com/sharepoint/v3/contenttype/forms"/>
-  </ds:schemaRefs>
-</ds:datastoreItem>
-</file>
-
-<file path=customXml/itemProps3.xml><?xml version="1.0" encoding="utf-8"?>
-<ds:datastoreItem xmlns:ds="http://schemas.openxmlformats.org/officeDocument/2006/customXml" ds:itemID="{2528CE1B-82B5-4F70-910C-9855C5CED1C8}">
-  <ds:schemaRefs>
-    <ds:schemaRef ds:uri="http://schemas.microsoft.com/office/2006/metadata/properties"/>
-    <ds:schemaRef ds:uri="http://schemas.microsoft.com/office/infopath/2007/PartnerControls"/>
-    <ds:schemaRef ds:uri="9bdcb1d6-9959-4866-ac5f-d407c1740622"/>
-  </ds:schemaRefs>
-</ds:datastoreItem>
 </file>
</xml_diff>